<commit_message>
Document SPINCO Sales daily sync + Meta Offline Conversions (v1.2)
Co-Authored-By: Claude Sonnet 5.5 <noreply@anthropic.com>
</commit_message>
<xml_diff>
--- a/docs/spinco-sales-to-bigquery.docx
+++ b/docs/spinco-sales-to-bigquery.docx
@@ -7,7 +7,7 @@
         <w:pStyle w:val="Heading1"/>
       </w:pPr>
       <w:r>
-        <w:t xml:space="preserve">SPINCO Sales → BigQuery Sync (spinco-sales-to-bigquery.yml)</w:t>
+        <w:t>SPINCO Sales → BigQuery + Meta Offline Conversions Sync (spinco-sales-to-bigquery.yml)</w:t>
       </w:r>
     </w:p>
     <w:p>
@@ -33,7 +33,7 @@
           <w:sz w:val="20"/>
           <w:szCs w:val="20"/>
         </w:rPr>
-        <w:t xml:space="preserve">Version: v1.1 — July 28, 2026</w:t>
+        <w:t>Version: v1.2 — September 29, 2026</w:t>
       </w:r>
     </w:p>
     <w:p>
@@ -50,7 +50,7 @@
         <w:spacing w:after="120"/>
       </w:pPr>
       <w:r>
-        <w:t xml:space="preserve">SPINCO counterpart to the b.cycle Sales sync. Pulls SPINCO's Orders report via MarianaTek's Reports API and appends new order lines into the existing SPINCO.Sales table on a weekly schedule.</w:t>
+        <w:t>SPINCO counterpart to the b.cycle Sales sync. Pulls SPINCO's Orders report via MarianaTek's Reports API and appends new order lines into the existing SPINCO.Sales table daily. As of v1.2 the same run also sends qualifying new sales to Meta as offline Purchase events (section 4b), so purchases the Meta pixel cannot see can be attributed back to ads.</w:t>
       </w:r>
     </w:p>
     <w:p>
@@ -72,7 +72,7 @@
         <w:spacing w:after="60"/>
       </w:pPr>
       <w:r>
-        <w:t xml:space="preserve">GitHub Action runs on a Monday 07:00 UTC schedule, or manually via workflow_dispatch.</w:t>
+        <w:t>GitHub Action runs daily at 07:23 UTC, or manually via workflow_dispatch.</w:t>
       </w:r>
     </w:p>
     <w:p>
@@ -138,6 +138,19 @@
       </w:pPr>
       <w:r>
         <w:t xml:space="preserve">Inserts new rows in batches of 500, then posts a summary to #bigquery-updates.</w:t>
+      </w:r>
+    </w:p>
+    <w:p>
+      <w:pPr>
+        <w:pStyle w:val="ListParagraph"/>
+        <w:numPr>
+          <w:ilvl w:val="0"/>
+          <w:numId w:val="1"/>
+        </w:numPr>
+        <w:spacing w:after="60"/>
+      </w:pPr>
+      <w:r>
+        <w:t>Of the rows just inserted, sends those with Product Type Credits, Memberships or any of the four gift card types (Line Status Completed, value above $0) to Meta as hashed Purchase events (section 4b).</w:t>
       </w:r>
     </w:p>
     <w:p>
@@ -680,6 +693,221 @@
         <w:spacing w:after="120" w:before="240"/>
       </w:pPr>
       <w:r>
+        <w:t>4b. Meta Offline Conversions</w:t>
+      </w:r>
+    </w:p>
+    <w:p>
+      <w:pPr>
+        <w:spacing w:after="120"/>
+      </w:pPr>
+      <w:r>
+        <w:t>Sends Purchase events to the Meta dataset "SPINCO Offline Data" (ID 1119305444099374), owned by the Spinco Franchise Inc business portfolio. Mirrors the b.cycle implementation in mtek-sales-to-bigquery.mjs.</w:t>
+      </w:r>
+    </w:p>
+    <w:p>
+      <w:pPr>
+        <w:pStyle w:val="ListParagraph"/>
+        <w:numPr>
+          <w:ilvl w:val="0"/>
+          <w:numId w:val="1"/>
+        </w:numPr>
+        <w:spacing w:after="60"/>
+      </w:pPr>
+      <w:r>
+        <w:t>Qualifying rows: Product Type in Credits, Memberships, Email Credit Gift Cards, Email Gift Cards, Physical Credit Gift Cards, Physical Gift Cards; Line Status Completed; Line Subtotal above 0.</w:t>
+      </w:r>
+    </w:p>
+    <w:p>
+      <w:pPr>
+        <w:pStyle w:val="ListParagraph"/>
+        <w:numPr>
+          <w:ilvl w:val="0"/>
+          <w:numId w:val="1"/>
+        </w:numPr>
+        <w:spacing w:after="60"/>
+      </w:pPr>
+      <w:r>
+        <w:t>$0 lines are skipped on purpose: roughly 20% of qualifying Credits and Memberships lines are genuine $0 lines (comps, promos, staff passes). Sending them would add fake Purchase events and dilute ad optimization. Note b.cycle does not apply this filter.</w:t>
+      </w:r>
+    </w:p>
+    <w:p>
+      <w:pPr>
+        <w:pStyle w:val="ListParagraph"/>
+        <w:numPr>
+          <w:ilvl w:val="0"/>
+          <w:numId w:val="1"/>
+        </w:numPr>
+        <w:spacing w:after="60"/>
+      </w:pPr>
+      <w:r>
+        <w:t>Value = Line Subtotal (tax-exclusive), currency from the row (CAD). action_source = physical_store.</w:t>
+      </w:r>
+    </w:p>
+    <w:p>
+      <w:pPr>
+        <w:pStyle w:val="ListParagraph"/>
+        <w:numPr>
+          <w:ilvl w:val="0"/>
+          <w:numId w:val="1"/>
+        </w:numPr>
+        <w:spacing w:after="60"/>
+      </w:pPr>
+      <w:r>
+        <w:t>Customer email, phone, first and last name come from a live MarianaTek GET /api/users/{id} lookup, then are lowercased and SHA-256 hashed. external_id is the hashed Customer ID.</w:t>
+      </w:r>
+    </w:p>
+    <w:p>
+      <w:pPr>
+        <w:pStyle w:val="ListParagraph"/>
+        <w:numPr>
+          <w:ilvl w:val="0"/>
+          <w:numId w:val="1"/>
+        </w:numPr>
+        <w:spacing w:after="60"/>
+      </w:pPr>
+      <w:r>
+        <w:t>event_time is derived from Transaction Date, not Order Date (membership renewals carry the original, often months-old order date). A same-UTC-day order uses the precise order timestamp instead of a noon-UTC default.</w:t>
+      </w:r>
+    </w:p>
+    <w:p>
+      <w:pPr>
+        <w:pStyle w:val="ListParagraph"/>
+        <w:numPr>
+          <w:ilvl w:val="0"/>
+          <w:numId w:val="1"/>
+        </w:numPr>
+        <w:spacing w:after="60"/>
+      </w:pPr>
+      <w:r>
+        <w:t>Meta rejects any batch containing an event older than 7 days, so events older than 6.5 days are skipped, as are events with neither email nor phone. A Meta failure posts to Slack and sets a failing exit code but never blocks the BigQuery inserts.</w:t>
+      </w:r>
+    </w:p>
+    <w:p>
+      <w:pPr>
+        <w:pStyle w:val="ListParagraph"/>
+        <w:numPr>
+          <w:ilvl w:val="0"/>
+          <w:numId w:val="1"/>
+        </w:numPr>
+        <w:spacing w:after="60"/>
+      </w:pPr>
+      <w:r>
+        <w:t>Only rows newly inserted in that run are sent. Rows already in BigQuery are never resent to Meta.</w:t>
+      </w:r>
+    </w:p>
+    <w:p>
+      <w:pPr>
+        <w:pStyle w:val="ListParagraph"/>
+        <w:numPr>
+          <w:ilvl w:val="0"/>
+          <w:numId w:val="1"/>
+        </w:numPr>
+        <w:spacing w:after="60"/>
+      </w:pPr>
+      <w:r>
+        <w:t>Test mode: dispatching with dry_run off AND meta_test_event_code set sends at most 20 events to Meta's Test events tab only, with no BigQuery insert and no Slack message. This exists because a normal live run inserts rows, and the next run would then treat them as already synced and never send them to Meta.</w:t>
+      </w:r>
+    </w:p>
+    <w:p>
+      <w:pPr>
+        <w:spacing w:after="120"/>
+      </w:pPr>
+      <w:r>
+        <w:t>How the token was set up (no values recorded here):</w:t>
+      </w:r>
+    </w:p>
+    <w:p>
+      <w:pPr>
+        <w:pStyle w:val="ListParagraph"/>
+        <w:numPr>
+          <w:ilvl w:val="0"/>
+          <w:numId w:val="1"/>
+        </w:numPr>
+        <w:spacing w:after="60"/>
+      </w:pPr>
+      <w:r>
+        <w:t>A System User token from an app owned by the Spinco Franchise Inc business, stored as the GitHub secret META_OFFLINE_CONVERSIONS_TOKEN_SPINCO. The b.cycle token cannot be reused: it returns permission error 100 against this dataset.</w:t>
+      </w:r>
+    </w:p>
+    <w:p>
+      <w:pPr>
+        <w:pStyle w:val="ListParagraph"/>
+        <w:numPr>
+          <w:ilvl w:val="0"/>
+          <w:numId w:val="1"/>
+        </w:numPr>
+        <w:spacing w:after="60"/>
+      </w:pPr>
+      <w:r>
+        <w:t>The system user needs BOTH an app role (Business Settings &gt; Accounts &gt; Apps &gt; add the system user with Manage app) AND the dataset assigned as an asset with full control (System users &gt; Add assets &gt; Datasets). Missing the app role shows 'No permissions available' in the Generate token dialog. Missing the dataset assignment makes every send fail with Graph error 100, subcode 33 ('Object does not exist... or missing permissions').</w:t>
+      </w:r>
+    </w:p>
+    <w:p>
+      <w:pPr>
+        <w:pStyle w:val="ListParagraph"/>
+        <w:numPr>
+          <w:ilvl w:val="0"/>
+          <w:numId w:val="1"/>
+        </w:numPr>
+        <w:spacing w:after="60"/>
+      </w:pPr>
+      <w:r>
+        <w:t>The Events Manager Settings tab (Generate access token) crashed with 'Something went wrong' during setup, which is why the Business Settings system user route was used.</w:t>
+      </w:r>
+    </w:p>
+    <w:p>
+      <w:pPr>
+        <w:spacing w:after="120"/>
+      </w:pPr>
+      <w:r>
+        <w:t>Other gotchas:</w:t>
+      </w:r>
+    </w:p>
+    <w:p>
+      <w:pPr>
+        <w:pStyle w:val="ListParagraph"/>
+        <w:numPr>
+          <w:ilvl w:val="0"/>
+          <w:numId w:val="1"/>
+        </w:numPr>
+        <w:spacing w:after="60"/>
+      </w:pPr>
+      <w:r>
+        <w:t>Meta never lets you view submitted production events back. The only field-level view is the Test events tab, and that page must be OPEN in Events Manager while the test send runs or nothing appears.</w:t>
+      </w:r>
+    </w:p>
+    <w:p>
+      <w:pPr>
+        <w:pStyle w:val="ListParagraph"/>
+        <w:numPr>
+          <w:ilvl w:val="0"/>
+          <w:numId w:val="1"/>
+        </w:numPr>
+        <w:spacing w:after="60"/>
+      </w:pPr>
+      <w:r>
+        <w:t>Meta's dataset stats lag by a day or more; an empty Overview on day one does not mean failure.</w:t>
+      </w:r>
+    </w:p>
+    <w:p>
+      <w:pPr>
+        <w:pStyle w:val="ListParagraph"/>
+        <w:numPr>
+          <w:ilvl w:val="0"/>
+          <w:numId w:val="1"/>
+        </w:numPr>
+        <w:spacing w:after="60"/>
+      </w:pPr>
+      <w:r>
+        <w:t>GitHub sometimes silently skips scheduled runs (it happened to the b.cycle daily job). BigQuery catches up from the last synced date, but Meta's 7-day limit means a gap of a week or more loses those events for good. If the #bigquery-updates message is missing on a morning, check Actions run history.</w:t>
+      </w:r>
+    </w:p>
+    <w:p>
+      <w:pPr>
+        <w:pStyle w:val="Heading2"/>
+        <w:spacing w:after="120" w:before="240"/>
+      </w:pPr>
+      <w:r>
         <w:t xml:space="preserve">5. Sync Window &amp; Catch-Up Logic</w:t>
       </w:r>
     </w:p>
@@ -985,6 +1213,96 @@
           </w:p>
         </w:tc>
       </w:tr>
+      <w:tr>
+        <w:tc>
+          <w:tcPr>
+            <w:tcW w:type="dxa" w:w="3200"/>
+          </w:tcPr>
+          <w:p>
+            <w:r>
+              <w:rPr>
+                <w:b w:val="false"/>
+                <w:bCs w:val="false"/>
+              </w:rPr>
+              <w:t>META_OFFLINE_CONVERSIONS_TOKEN_SPINCO</w:t>
+            </w:r>
+          </w:p>
+        </w:tc>
+        <w:tc>
+          <w:tcPr>
+            <w:tcW w:type="dxa" w:w="6560"/>
+          </w:tcPr>
+          <w:p>
+            <w:r>
+              <w:rPr>
+                <w:b w:val="false"/>
+                <w:bCs w:val="false"/>
+              </w:rPr>
+              <w:t>Meta System User access token for the SPINCO Offline Data dataset (GitHub secret)</w:t>
+            </w:r>
+          </w:p>
+        </w:tc>
+      </w:tr>
+      <w:tr>
+        <w:tc>
+          <w:tcPr>
+            <w:tcW w:type="dxa" w:w="3200"/>
+          </w:tcPr>
+          <w:p>
+            <w:r>
+              <w:rPr>
+                <w:b w:val="false"/>
+                <w:bCs w:val="false"/>
+              </w:rPr>
+              <w:t>META_OFFLINE_DATASET_ID_SPINCO</w:t>
+            </w:r>
+          </w:p>
+        </w:tc>
+        <w:tc>
+          <w:tcPr>
+            <w:tcW w:type="dxa" w:w="6560"/>
+          </w:tcPr>
+          <w:p>
+            <w:r>
+              <w:rPr>
+                <w:b w:val="false"/>
+                <w:bCs w:val="false"/>
+              </w:rPr>
+              <w:t>Optional override; defaults to 1119305444099374</w:t>
+            </w:r>
+          </w:p>
+        </w:tc>
+      </w:tr>
+      <w:tr>
+        <w:tc>
+          <w:tcPr>
+            <w:tcW w:type="dxa" w:w="3200"/>
+          </w:tcPr>
+          <w:p>
+            <w:r>
+              <w:rPr>
+                <w:b w:val="false"/>
+                <w:bCs w:val="false"/>
+              </w:rPr>
+              <w:t>META_TEST_EVENT_CODE</w:t>
+            </w:r>
+          </w:p>
+        </w:tc>
+        <w:tc>
+          <w:tcPr>
+            <w:tcW w:type="dxa" w:w="6560"/>
+          </w:tcPr>
+          <w:p>
+            <w:r>
+              <w:rPr>
+                <w:b w:val="false"/>
+                <w:bCs w:val="false"/>
+              </w:rPr>
+              <w:t>Optional. Set via the workflow's meta_test_event_code input to run Test mode (section 4b)</w:t>
+            </w:r>
+          </w:p>
+        </w:tc>
+      </w:tr>
     </w:tbl>
     <w:p>
       <w:pPr>
@@ -1170,7 +1488,7 @@
                 <w:b w:val="false"/>
                 <w:bCs w:val="false"/>
               </w:rPr>
-              <w:t xml:space="preserve">cron: "0 7 * * 1" — every Monday 07:00 UTC (fixed, not DST-adjusted)</w:t>
+              <w:t>cron: "23 7 * * *" — daily 07:23 UTC (fixed, not DST-adjusted; off the top of the hour to dodge GitHub cron contention)</w:t>
             </w:r>
           </w:p>
         </w:tc>
@@ -1200,7 +1518,7 @@
                 <w:b w:val="false"/>
                 <w:bCs w:val="false"/>
               </w:rPr>
-              <w:t xml:space="preserve">workflow_dispatch with a dry_run boolean input, default true</w:t>
+              <w:t>workflow_dispatch with a dry_run boolean input (default true) and an optional meta_test_event_code string input</w:t>
             </w:r>
           </w:p>
         </w:tc>
@@ -1315,6 +1633,19 @@
       </w:pPr>
       <w:r>
         <w:t xml:space="preserve">SLACK_BIGQUERY_UPDATES_WEBHOOK_URL</w:t>
+      </w:r>
+    </w:p>
+    <w:p>
+      <w:pPr>
+        <w:pStyle w:val="ListParagraph"/>
+        <w:numPr>
+          <w:ilvl w:val="0"/>
+          <w:numId w:val="1"/>
+        </w:numPr>
+        <w:spacing w:after="60"/>
+      </w:pPr>
+      <w:r>
+        <w:t>META_OFFLINE_CONVERSIONS_TOKEN_SPINCO</w:t>
       </w:r>
     </w:p>
     <w:p>
@@ -1524,15 +1855,89 @@
         <w:spacing w:after="120" w:before="240"/>
       </w:pPr>
       <w:r>
-        <w:t xml:space="preserve">13. Summary</w:t>
-      </w:r>
-    </w:p>
-    <w:p>
-      <w:pPr>
-        <w:spacing w:after="120"/>
-      </w:pPr>
-      <w:r>
-        <w:t xml:space="preserve">Automates SPINCO's weekly Sales report → BigQuery upload. Benefited directly from the dedup-key lesson learned on b.cycle's Sales build; surfaced a separate, pre-existing MarianaTek report data-quality issue (duplicate gift-card lines) that is documented but intentionally not auto-fixed.</w:t>
+        <w:t>13. Verification Record (Meta, September 29, 2026)</w:t>
+      </w:r>
+    </w:p>
+    <w:p>
+      <w:pPr>
+        <w:pStyle w:val="ListParagraph"/>
+        <w:numPr>
+          <w:ilvl w:val="0"/>
+          <w:numId w:val="1"/>
+        </w:numPr>
+        <w:spacing w:after="60"/>
+      </w:pPr>
+      <w:r>
+        <w:t>Dry run over 26-28 Sep: 1,550 new rows, 1,319 Meta events built with hashed email, phone and name; none skipped for missing contact info or age.</w:t>
+      </w:r>
+    </w:p>
+    <w:p>
+      <w:pPr>
+        <w:pStyle w:val="ListParagraph"/>
+        <w:numPr>
+          <w:ilvl w:val="0"/>
+          <w:numId w:val="1"/>
+        </w:numPr>
+        <w:spacing w:after="60"/>
+      </w:pPr>
+      <w:r>
+        <w:t>Found during the dry run: about 20% of qualifying lines were $0. Confirmed against BigQuery as genuine data, not a bug, then filtered out.</w:t>
+      </w:r>
+    </w:p>
+    <w:p>
+      <w:pPr>
+        <w:pStyle w:val="ListParagraph"/>
+        <w:numPr>
+          <w:ilvl w:val="0"/>
+          <w:numId w:val="1"/>
+        </w:numPr>
+        <w:spacing w:after="60"/>
+      </w:pPr>
+      <w:r>
+        <w:t>Test send with a test event code: the first attempt failed with Graph error 100 / subcode 33 (system user lacked the dataset asset). After assigning it, 20 of 20 events were accepted; a second send with the Test events page open showed 20 Purchase events with status Processed.</w:t>
+      </w:r>
+    </w:p>
+    <w:p>
+      <w:pPr>
+        <w:pStyle w:val="ListParagraph"/>
+        <w:numPr>
+          <w:ilvl w:val="0"/>
+          <w:numId w:val="1"/>
+        </w:numPr>
+        <w:spacing w:after="60"/>
+      </w:pPr>
+      <w:r>
+        <w:t>Live catch-up run: 1,550 rows inserted and 1,114 events sent, all acknowledged by Meta; 205 $0 lines skipped.</w:t>
+      </w:r>
+    </w:p>
+    <w:p>
+      <w:pPr>
+        <w:pStyle w:val="ListParagraph"/>
+        <w:numPr>
+          <w:ilvl w:val="0"/>
+          <w:numId w:val="1"/>
+        </w:numPr>
+        <w:spacing w:after="60"/>
+      </w:pPr>
+      <w:r>
+        <w:t>Known gap: 538 rows dated 26-27 Sep were already in BigQuery from the old weekly sync, so they were never sent to Meta. Accepted as a small one-time hole.</w:t>
+      </w:r>
+    </w:p>
+    <w:p>
+      <w:pPr>
+        <w:pStyle w:val="Heading2"/>
+        <w:spacing w:after="120" w:before="240"/>
+      </w:pPr>
+      <w:r>
+        <w:t>14. Summary</w:t>
+      </w:r>
+    </w:p>
+    <w:p>
+      <w:pPr>
+        <w:spacing w:after="120"/>
+      </w:pPr>
+      <w:r>
+        <w:t>Automates SPINCO's daily Sales report → BigQuery upload and, as of v1.2, sends qualifying new purchases to Meta as offline conversions. Benefited directly from the dedup-key lesson learned on b.cycle's Sales build; surfaced a separate, pre-existing MarianaTek report data-quality issue (duplicate gift-card lines) that is documented but intentionally not auto-fixed.</w:t>
       </w:r>
     </w:p>
     <w:sectPr>

</xml_diff>